<commit_message>
Name asyncio for the PyQt5 app's 40% gain
- CVs, Word copies and LinkedIn.md say asyncio + background threads
- asyncio added to the Python skills on every CV and on LinkedIn
- facts.md records asyncio as the source of the gain
- Talking guide: how asyncio works, using it with Qt's event loop,
  what blocks the loop, key terms; glossary entries for asyncio and
  coroutines
</commit_message>
<xml_diff>
--- a/Career-Roadmap/CV/cv-embedded.docx
+++ b/Career-Roadmap/CV/cv-embedded.docx
@@ -286,7 +286,7 @@
           <w:i w:val="0"/>
           <w:sz w:val="20"/>
         </w:rPr>
-        <w:t>Built the PyQt5 desktop app that controls the simulator over a UART protocol; cut its CPU usage and latency by about 40% (measured) using async I/O and background threads, off the UI thread.</w:t>
+        <w:t>Built the PyQt5 desktop app that controls the simulator over a UART protocol; cut its CPU usage and latency by about 40% (measured) using asyncio and background threads, off the UI thread.</w:t>
       </w:r>
     </w:p>
     <w:p>
@@ -1104,7 +1104,7 @@
           <w:i w:val="0"/>
           <w:sz w:val="20"/>
         </w:rPr>
-        <w:t>C, C++ (modern), Rust, Python, Bash, Verilog</w:t>
+        <w:t>C, C++ (modern), Rust, Python (asyncio, PyQt5), Bash, Verilog</w:t>
       </w:r>
     </w:p>
     <w:p>
@@ -1173,7 +1173,7 @@
           <w:i w:val="0"/>
           <w:sz w:val="20"/>
         </w:rPr>
-        <w:t>UART, I2C, SPI, CAN, TCP/UDP, REST; Git, GitHub Actions CI, CMake, Make, PyQt5, debugging</w:t>
+        <w:t>UART, I2C, SPI, CAN, TCP/UDP, REST; Git, GitHub Actions CI, CMake, Make, debugging</w:t>
       </w:r>
     </w:p>
     <w:p>

</xml_diff>

<commit_message>
Fix unusual wording across all CVs
- General summary: split the run-on sentence about GSoC and EKSON
- Systems: 'upstream code review'; full crate names instead of '-client'
- Embedded: clearer summary; 'Activities' bullet instead of achievements
  mixed into the grade line; 'AUTOSAR specification' instead of 'spec'
- Master: no double parentheses for Boa; 'Software-Defined Vehicles'
  instead of the SDV acronym; 'Other projects' instead of 'More';
  'still maintaining it'; 'Xilinx FPGA tools'
- Removed '150+ lines' and the unverified '20% timing errors' metric
- 'Team projects' instead of 'Team projects (co-developed)'
- 'Treasurer, IEEE Student Branch, Minia University' in standard form
</commit_message>
<xml_diff>
--- a/Career-Roadmap/CV/cv-embedded.docx
+++ b/Career-Roadmap/CV/cv-embedded.docx
@@ -122,7 +122,7 @@
           <w:i w:val="0"/>
           <w:sz w:val="20"/>
         </w:rPr>
-        <w:t>Embedded software engineer; sole software engineer at EKSON, writing and owning the Zephyr RTOS firmware for pneumatic motion simulators. Embedded Linux experience with Yocto and Buildroot, a merged Zephyr networking contribution, and the COSMIC Settings Printers page built in Google Summer of Code 2026 with The Linux Foundation. Writes C, C++ and Rust.</w:t>
+        <w:t>Embedded software engineer who writes and owns the Zephyr RTOS firmware for EKSON's pneumatic motion simulators, as its sole software engineer. Embedded Linux experience with Yocto and Buildroot, a merged Zephyr networking contribution, and the COSMIC Settings Printers page built in Google Summer of Code 2026 with The Linux Foundation. Works in C, modern C++ and Rust.</w:t>
       </w:r>
     </w:p>
     <w:p>
@@ -652,7 +652,7 @@
           <w:i w:val="0"/>
           <w:sz w:val="20"/>
         </w:rPr>
-        <w:t xml:space="preserve"> socket option for IPv4 across 6 networking modules (150+ lines), reviewed and merged upstream (</w:t>
+        <w:t xml:space="preserve"> socket option for IPv4 across 6 networking modules, reviewed and merged upstream (</w:t>
       </w:r>
       <w:hyperlink r:id="rId14">
         <w:r>
@@ -981,7 +981,7 @@
           <w:i w:val="0"/>
           <w:sz w:val="20"/>
         </w:rPr>
-        <w:t xml:space="preserve"> (C, TM4C): MCAL drivers written and validated to the AUTOSAR spec.</w:t>
+        <w:t xml:space="preserve"> (C, TM4C): MCAL drivers developed and tested against the AUTOSAR specification.</w:t>
       </w:r>
     </w:p>
     <w:p>
@@ -1265,7 +1265,35 @@
           <w:i w:val="0"/>
           <w:sz w:val="20"/>
         </w:rPr>
-        <w:t>Grade: Very Good with Honors. Codeforces Expert; 4-time ECPC finalist (2021–2024); IEEE student branch Treasurer.</w:t>
+        <w:t>Grade: Very Good with Honors.</w:t>
+      </w:r>
+    </w:p>
+    <w:p>
+      <w:pPr>
+        <w:tabs>
+          <w:tab w:pos="259" w:val="left"/>
+        </w:tabs>
+        <w:spacing w:before="0" w:after="0" w:line="240" w:lineRule="auto"/>
+        <w:ind w:left="259" w:hanging="187"/>
+      </w:pPr>
+      <w:r>
+        <w:rPr>
+          <w:rFonts w:ascii="Calibri" w:hAnsi="Calibri"/>
+          <w:b w:val="0"/>
+          <w:i w:val="0"/>
+          <w:sz w:val="20"/>
+        </w:rPr>
+        <w:t>•</w:t>
+        <w:tab/>
+      </w:r>
+      <w:r>
+        <w:rPr>
+          <w:rFonts w:ascii="Calibri" w:hAnsi="Calibri"/>
+          <w:b w:val="0"/>
+          <w:i w:val="0"/>
+          <w:sz w:val="20"/>
+        </w:rPr>
+        <w:t>Activities: Codeforces Expert; 4-time ECPC finalist (2021–2024); Treasurer, IEEE Student Branch.</w:t>
       </w:r>
     </w:p>
     <w:sectPr>

</xml_diff>

<commit_message>
Follow the Google Summer of Code wording rules in the CVs and LinkedIn
Write "Google Summer of Code 2026 Contributor" with The Linux Foundation
(OpenPrinting), drop the GSoC acronym, and stop presenting the program as a
job. Add the program's rules to LinkedIn.md and rebuild the PDFs and Word
copies.
</commit_message>
<xml_diff>
--- a/Career-Roadmap/CV/cv-embedded.docx
+++ b/Career-Roadmap/CV/cv-embedded.docx
@@ -122,7 +122,7 @@
           <w:i w:val="0"/>
           <w:sz w:val="20"/>
         </w:rPr>
-        <w:t>Embedded software engineer who writes and owns the Zephyr RTOS firmware for EKSON's pneumatic motion simulators, as its sole software engineer. Embedded Linux experience with Yocto and Buildroot, a merged Zephyr networking contribution, and the COSMIC Settings Printers page built in Google Summer of Code 2026 with The Linux Foundation. Works in C, modern C++ and Rust.</w:t>
+        <w:t>Embedded software engineer who writes and owns the Zephyr RTOS firmware for EKSON's pneumatic motion simulators, as its sole software engineer. Embedded Linux experience with Yocto and Buildroot, a merged Zephyr networking contribution, and the COSMIC Settings Printers page, built as a Google Summer of Code 2026 contributor with The Linux Foundation (OpenPrinting). Works in C, modern C++ and Rust.</w:t>
       </w:r>
     </w:p>
     <w:p>
@@ -330,7 +330,7 @@
           <w:color w:val="1B2A47"/>
           <w:sz w:val="20"/>
         </w:rPr>
-        <w:t>Software Developer (Google Summer of Code)</w:t>
+        <w:t>Google Summer of Code Contributor</w:t>
       </w:r>
       <w:r>
         <w:rPr>
@@ -350,7 +350,7 @@
           <w:color w:val="1B2A47"/>
           <w:sz w:val="20"/>
         </w:rPr>
-        <w:t>The Linux Foundation / OpenPrinting</w:t>
+        <w:t>The Linux Foundation (OpenPrinting)</w:t>
       </w:r>
       <w:r>
         <w:rPr>
@@ -386,7 +386,7 @@
           <w:color w:val="4A5568"/>
           <w:sz w:val="19"/>
         </w:rPr>
-        <w:t xml:space="preserve">Google Summer of Code (GSoC) 2026: Printers page for COSMIC Settings, in Rust  |  </w:t>
+        <w:t xml:space="preserve">Open-source project: Printers page for COSMIC Settings, in Rust  |  </w:t>
       </w:r>
       <w:hyperlink r:id="rId12">
         <w:r>

</xml_diff>

<commit_message>
Drop the "sole software engineer" claim for EKSON
EKSON has other software engineers; the CVs, LinkedIn text and interview
notes now describe the simulator software he owns without that claim.
</commit_message>
<xml_diff>
--- a/Career-Roadmap/CV/cv-embedded.docx
+++ b/Career-Roadmap/CV/cv-embedded.docx
@@ -122,7 +122,7 @@
           <w:i w:val="0"/>
           <w:sz w:val="20"/>
         </w:rPr>
-        <w:t>Embedded software engineer who writes and owns the Zephyr RTOS firmware for EKSON's pneumatic motion simulators, as its sole software engineer. Embedded Linux experience with Yocto and Buildroot, a merged Zephyr networking contribution, and the COSMIC Settings Printers page, built as a Google Summer of Code 2026 contributor with The Linux Foundation (OpenPrinting). Works in C, modern C++ and Rust.</w:t>
+        <w:t>Embedded software engineer who writes and owns the Zephyr RTOS firmware for EKSON's pneumatic motion simulators. Embedded Linux experience with Yocto and Buildroot, a merged Zephyr networking contribution, and the COSMIC Settings Printers page, built as a Google Summer of Code 2026 contributor with The Linux Foundation (OpenPrinting). Works in C, modern C++ and Rust.</w:t>
       </w:r>
     </w:p>
     <w:p>
@@ -202,7 +202,7 @@
           <w:color w:val="4A5568"/>
           <w:sz w:val="19"/>
         </w:rPr>
-        <w:t>Sole software engineer for 3-DoF and 6-DoF pneumatic motion simulators: firmware, desktop app, backend and CI</w:t>
+        <w:t>Software for 3-DoF and 6-DoF pneumatic motion simulators: firmware, desktop app, backend and CI</w:t>
       </w:r>
     </w:p>
     <w:p>

</xml_diff>

<commit_message>
CV: tailored copies for the 5 shortlisted roles, fix repeated 'merged', swap Amazon role to SDE 2027
</commit_message>
<xml_diff>
--- a/Career-Roadmap/CV/cv-embedded.docx
+++ b/Career-Roadmap/CV/cv-embedded.docx
@@ -286,7 +286,7 @@
           <w:i w:val="0"/>
           <w:sz w:val="20"/>
         </w:rPr>
-        <w:t>Built the PyQt5 desktop app that controls the simulator over a UART protocol; cut its CPU usage and latency by about 40% (measured) using asyncio to wait for ESP32 and server messages concurrently, off the UI thread.</w:t>
+        <w:t>Developed the PyQt5 desktop app that controls the simulator over a UART protocol; cut its CPU usage and latency by about 40% (measured) using asyncio to wait for ESP32 and server messages concurrently, off the UI thread.</w:t>
       </w:r>
     </w:p>
     <w:p>
@@ -314,7 +314,7 @@
           <w:i w:val="0"/>
           <w:sz w:val="20"/>
         </w:rPr>
-        <w:t>Built remote operation and firmware updates: a Node.js/Express + MongoDB backend that the desktop app polls over REST, then flashes new firmware with esptool; GitHub Actions CI.</w:t>
+        <w:t>Engineered remote operation and firmware updates: a Node.js/Express + MongoDB backend that the desktop app polls over REST, then flashes new firmware with esptool; GitHub Actions CI.</w:t>
       </w:r>
     </w:p>
     <w:p>
@@ -496,7 +496,7 @@
           <w:i w:val="0"/>
           <w:sz w:val="20"/>
         </w:rPr>
-        <w:t>7 PRs merged upstream</w:t>
+        <w:t>7 PRs accepted upstream</w:t>
       </w:r>
       <w:r>
         <w:rPr>
@@ -589,7 +589,7 @@
           <w:i w:val="0"/>
           <w:sz w:val="20"/>
         </w:rPr>
-        <w:t>Built Linux images with Yocto and Buildroot and wrote a Linux kernel module; worked with device trees, root file systems and hardware flashing. Scored 100% in the final evaluation.</w:t>
+        <w:t>Created custom Linux images with Yocto and Buildroot and wrote a Linux kernel module; worked with device trees, root file systems and hardware flashing. Scored 100% in the final evaluation.</w:t>
       </w:r>
     </w:p>
     <w:p>
@@ -725,7 +725,7 @@
           <w:i w:val="0"/>
           <w:sz w:val="20"/>
         </w:rPr>
-        <w:t>, merged).</w:t>
+        <w:t>).</w:t>
       </w:r>
     </w:p>
     <w:p>
@@ -798,7 +798,7 @@
           <w:i w:val="0"/>
           <w:sz w:val="20"/>
         </w:rPr>
-        <w:t>), both merged.</w:t>
+        <w:t>), both landed upstream.</w:t>
       </w:r>
     </w:p>
     <w:p>
@@ -843,7 +843,7 @@
           <w:i w:val="0"/>
           <w:sz w:val="20"/>
         </w:rPr>
-        <w:t xml:space="preserve"> (graduation project, STM32): built the firmware update path (an ESP32/RPi gateway sends the image over UART) and a dual-bank bootloader with CRC check and rollback. </w:t>
+        <w:t xml:space="preserve"> (graduation project, STM32): implemented the firmware update path (an ESP32/RPi gateway sends the image over UART) and a dual-bank bootloader with CRC check and rollback. </w:t>
       </w:r>
       <w:hyperlink r:id="rId18">
         <w:r>

</xml_diff>